<commit_message>
FEAT: Bootstrap Editor v2
</commit_message>
<xml_diff>
--- a/web/samples/barcode_samples.docx
+++ b/web/samples/barcode_samples.docx
@@ -269,6 +269,783 @@
                 </wp:inline>
               </w:drawing>
             </w:r>
+          </w:p>
+        </w:tc>
+      </w:tr>
+      <w:tr>
+        <w:tc>
+          <w:tcPr>
+            <w:tcW w:w="2407" w:type="dxa"/>
+            <w:vAlign w:val="center"/>
+          </w:tcPr>
+          <w:p>
+            <w:pPr>
+              <w:jc w:val="center"/>
+              <w:rPr>
+                <w:noProof/>
+              </w:rPr>
+            </w:pPr>
+          </w:p>
+        </w:tc>
+        <w:tc>
+          <w:tcPr>
+            <w:tcW w:w="2407" w:type="dxa"/>
+            <w:vAlign w:val="center"/>
+          </w:tcPr>
+          <w:p>
+            <w:pPr>
+              <w:jc w:val="center"/>
+              <w:rPr>
+                <w:noProof/>
+              </w:rPr>
+            </w:pPr>
+          </w:p>
+        </w:tc>
+        <w:tc>
+          <w:tcPr>
+            <w:tcW w:w="2407" w:type="dxa"/>
+            <w:vAlign w:val="center"/>
+          </w:tcPr>
+          <w:p>
+            <w:pPr>
+              <w:jc w:val="center"/>
+              <w:rPr>
+                <w:noProof/>
+              </w:rPr>
+            </w:pPr>
+          </w:p>
+        </w:tc>
+        <w:tc>
+          <w:tcPr>
+            <w:tcW w:w="2407" w:type="dxa"/>
+            <w:vAlign w:val="center"/>
+          </w:tcPr>
+          <w:p>
+            <w:pPr>
+              <w:jc w:val="center"/>
+              <w:rPr>
+                <w:noProof/>
+              </w:rPr>
+            </w:pPr>
+          </w:p>
+        </w:tc>
+      </w:tr>
+      <w:tr>
+        <w:tc>
+          <w:tcPr>
+            <w:tcW w:w="2407" w:type="dxa"/>
+            <w:vAlign w:val="center"/>
+          </w:tcPr>
+          <w:p>
+            <w:pPr>
+              <w:jc w:val="center"/>
+              <w:rPr>
+                <w:noProof/>
+              </w:rPr>
+            </w:pPr>
+          </w:p>
+        </w:tc>
+        <w:tc>
+          <w:tcPr>
+            <w:tcW w:w="2407" w:type="dxa"/>
+            <w:vAlign w:val="center"/>
+          </w:tcPr>
+          <w:p>
+            <w:pPr>
+              <w:jc w:val="center"/>
+              <w:rPr>
+                <w:noProof/>
+              </w:rPr>
+            </w:pPr>
+          </w:p>
+        </w:tc>
+        <w:tc>
+          <w:tcPr>
+            <w:tcW w:w="2407" w:type="dxa"/>
+            <w:vAlign w:val="center"/>
+          </w:tcPr>
+          <w:p>
+            <w:pPr>
+              <w:jc w:val="center"/>
+              <w:rPr>
+                <w:noProof/>
+              </w:rPr>
+            </w:pPr>
+          </w:p>
+        </w:tc>
+        <w:tc>
+          <w:tcPr>
+            <w:tcW w:w="2407" w:type="dxa"/>
+            <w:vAlign w:val="center"/>
+          </w:tcPr>
+          <w:p>
+            <w:pPr>
+              <w:jc w:val="center"/>
+              <w:rPr>
+                <w:noProof/>
+              </w:rPr>
+            </w:pPr>
+          </w:p>
+        </w:tc>
+      </w:tr>
+      <w:tr>
+        <w:tc>
+          <w:tcPr>
+            <w:tcW w:w="2407" w:type="dxa"/>
+            <w:vAlign w:val="center"/>
+          </w:tcPr>
+          <w:p>
+            <w:pPr>
+              <w:jc w:val="center"/>
+              <w:rPr>
+                <w:noProof/>
+              </w:rPr>
+            </w:pPr>
+          </w:p>
+        </w:tc>
+        <w:tc>
+          <w:tcPr>
+            <w:tcW w:w="2407" w:type="dxa"/>
+            <w:vAlign w:val="center"/>
+          </w:tcPr>
+          <w:p>
+            <w:pPr>
+              <w:jc w:val="center"/>
+              <w:rPr>
+                <w:noProof/>
+              </w:rPr>
+            </w:pPr>
+          </w:p>
+        </w:tc>
+        <w:tc>
+          <w:tcPr>
+            <w:tcW w:w="2407" w:type="dxa"/>
+            <w:vAlign w:val="center"/>
+          </w:tcPr>
+          <w:p>
+            <w:pPr>
+              <w:jc w:val="center"/>
+              <w:rPr>
+                <w:noProof/>
+              </w:rPr>
+            </w:pPr>
+          </w:p>
+        </w:tc>
+        <w:tc>
+          <w:tcPr>
+            <w:tcW w:w="2407" w:type="dxa"/>
+            <w:vAlign w:val="center"/>
+          </w:tcPr>
+          <w:p>
+            <w:pPr>
+              <w:jc w:val="center"/>
+              <w:rPr>
+                <w:noProof/>
+              </w:rPr>
+            </w:pPr>
+          </w:p>
+        </w:tc>
+      </w:tr>
+      <w:tr>
+        <w:tc>
+          <w:tcPr>
+            <w:tcW w:w="2407" w:type="dxa"/>
+            <w:vAlign w:val="center"/>
+          </w:tcPr>
+          <w:p>
+            <w:pPr>
+              <w:jc w:val="center"/>
+              <w:rPr>
+                <w:noProof/>
+              </w:rPr>
+            </w:pPr>
+          </w:p>
+        </w:tc>
+        <w:tc>
+          <w:tcPr>
+            <w:tcW w:w="2407" w:type="dxa"/>
+            <w:vAlign w:val="center"/>
+          </w:tcPr>
+          <w:p>
+            <w:pPr>
+              <w:jc w:val="center"/>
+              <w:rPr>
+                <w:noProof/>
+              </w:rPr>
+            </w:pPr>
+          </w:p>
+        </w:tc>
+        <w:tc>
+          <w:tcPr>
+            <w:tcW w:w="2407" w:type="dxa"/>
+            <w:vAlign w:val="center"/>
+          </w:tcPr>
+          <w:p>
+            <w:pPr>
+              <w:jc w:val="center"/>
+              <w:rPr>
+                <w:noProof/>
+              </w:rPr>
+            </w:pPr>
+          </w:p>
+        </w:tc>
+        <w:tc>
+          <w:tcPr>
+            <w:tcW w:w="2407" w:type="dxa"/>
+            <w:vAlign w:val="center"/>
+          </w:tcPr>
+          <w:p>
+            <w:pPr>
+              <w:jc w:val="center"/>
+              <w:rPr>
+                <w:noProof/>
+              </w:rPr>
+            </w:pPr>
+          </w:p>
+        </w:tc>
+      </w:tr>
+      <w:tr>
+        <w:tc>
+          <w:tcPr>
+            <w:tcW w:w="2407" w:type="dxa"/>
+            <w:vAlign w:val="center"/>
+          </w:tcPr>
+          <w:p>
+            <w:pPr>
+              <w:jc w:val="center"/>
+              <w:rPr>
+                <w:rFonts w:ascii="3 of 9 Barcode" w:hAnsi="3 of 9 Barcode"/>
+              </w:rPr>
+            </w:pPr>
+            <w:r>
+              <w:rPr>
+                <w:rFonts w:ascii="3 of 9 Barcode" w:hAnsi="3 of 9 Barcode"/>
+              </w:rPr>
+              <w:t>*8051234567890*</w:t>
+            </w:r>
+          </w:p>
+          <w:p>
+            <w:pPr>
+              <w:jc w:val="center"/>
+              <w:rPr>
+                <w:rFonts w:ascii="3 of 9 Barcode" w:hAnsi="3 of 9 Barcode"/>
+              </w:rPr>
+            </w:pPr>
+            <w:r>
+              <w:rPr>
+                <w:rFonts w:ascii="3 of 9 Barcode" w:hAnsi="3 of 9 Barcode"/>
+              </w:rPr>
+              <w:t>*</w:t>
+            </w:r>
+            <w:r>
+              <w:rPr>
+                <w:rFonts w:ascii="3 of 9 Barcode" w:hAnsi="3 of 9 Barcode"/>
+              </w:rPr>
+              <w:t>8051234567890</w:t>
+            </w:r>
+            <w:r>
+              <w:rPr>
+                <w:rFonts w:ascii="3 of 9 Barcode" w:hAnsi="3 of 9 Barcode"/>
+              </w:rPr>
+              <w:t>*</w:t>
+            </w:r>
+          </w:p>
+          <w:p>
+            <w:pPr>
+              <w:jc w:val="center"/>
+              <w:rPr>
+                <w:rFonts w:ascii="3 of 9 Barcode" w:hAnsi="3 of 9 Barcode"/>
+              </w:rPr>
+            </w:pPr>
+            <w:r>
+              <w:rPr>
+                <w:rFonts w:ascii="3 of 9 Barcode" w:hAnsi="3 of 9 Barcode"/>
+              </w:rPr>
+              <w:t>*</w:t>
+            </w:r>
+            <w:r>
+              <w:rPr>
+                <w:rFonts w:ascii="3 of 9 Barcode" w:hAnsi="3 of 9 Barcode"/>
+              </w:rPr>
+              <w:t>8051234567890</w:t>
+            </w:r>
+            <w:r>
+              <w:rPr>
+                <w:rFonts w:ascii="3 of 9 Barcode" w:hAnsi="3 of 9 Barcode"/>
+              </w:rPr>
+              <w:t>*</w:t>
+            </w:r>
+          </w:p>
+          <w:p>
+            <w:pPr>
+              <w:jc w:val="center"/>
+              <w:rPr>
+                <w:rFonts w:ascii="3 of 9 Barcode" w:hAnsi="3 of 9 Barcode"/>
+              </w:rPr>
+            </w:pPr>
+            <w:r>
+              <w:rPr>
+                <w:rFonts w:ascii="3 of 9 Barcode" w:hAnsi="3 of 9 Barcode"/>
+              </w:rPr>
+              <w:t>*</w:t>
+            </w:r>
+            <w:r>
+              <w:rPr>
+                <w:rFonts w:ascii="3 of 9 Barcode" w:hAnsi="3 of 9 Barcode"/>
+              </w:rPr>
+              <w:t>8051234567890</w:t>
+            </w:r>
+            <w:r>
+              <w:rPr>
+                <w:rFonts w:ascii="3 of 9 Barcode" w:hAnsi="3 of 9 Barcode"/>
+              </w:rPr>
+              <w:t>*</w:t>
+            </w:r>
+          </w:p>
+        </w:tc>
+        <w:tc>
+          <w:tcPr>
+            <w:tcW w:w="2407" w:type="dxa"/>
+            <w:vAlign w:val="center"/>
+          </w:tcPr>
+          <w:p>
+            <w:pPr>
+              <w:jc w:val="center"/>
+              <w:rPr>
+                <w:rFonts w:ascii="3 of 9 Barcode" w:hAnsi="3 of 9 Barcode"/>
+                <w:noProof/>
+              </w:rPr>
+            </w:pPr>
+            <w:r>
+              <w:rPr>
+                <w:rFonts w:ascii="3 of 9 Barcode" w:hAnsi="3 of 9 Barcode"/>
+                <w:noProof/>
+              </w:rPr>
+              <w:t>*</w:t>
+            </w:r>
+            <w:r>
+              <w:rPr>
+                <w:rFonts w:ascii="3 of 9 Barcode" w:hAnsi="3 of 9 Barcode"/>
+              </w:rPr>
+              <w:t>8051234567891</w:t>
+            </w:r>
+            <w:r>
+              <w:rPr>
+                <w:rFonts w:ascii="3 of 9 Barcode" w:hAnsi="3 of 9 Barcode"/>
+                <w:noProof/>
+              </w:rPr>
+              <w:t>*</w:t>
+            </w:r>
+          </w:p>
+          <w:p>
+            <w:pPr>
+              <w:jc w:val="center"/>
+              <w:rPr>
+                <w:rFonts w:ascii="3 of 9 Barcode" w:hAnsi="3 of 9 Barcode"/>
+                <w:noProof/>
+              </w:rPr>
+            </w:pPr>
+            <w:r>
+              <w:rPr>
+                <w:rFonts w:ascii="3 of 9 Barcode" w:hAnsi="3 of 9 Barcode"/>
+                <w:noProof/>
+              </w:rPr>
+              <w:t>*</w:t>
+            </w:r>
+            <w:r>
+              <w:rPr>
+                <w:rFonts w:ascii="3 of 9 Barcode" w:hAnsi="3 of 9 Barcode"/>
+              </w:rPr>
+              <w:t>8051234567891</w:t>
+            </w:r>
+            <w:r>
+              <w:rPr>
+                <w:rFonts w:ascii="3 of 9 Barcode" w:hAnsi="3 of 9 Barcode"/>
+                <w:noProof/>
+              </w:rPr>
+              <w:t>*</w:t>
+            </w:r>
+          </w:p>
+          <w:p>
+            <w:pPr>
+              <w:jc w:val="center"/>
+              <w:rPr>
+                <w:rFonts w:ascii="3 of 9 Barcode" w:hAnsi="3 of 9 Barcode"/>
+                <w:noProof/>
+              </w:rPr>
+            </w:pPr>
+            <w:r>
+              <w:rPr>
+                <w:rFonts w:ascii="3 of 9 Barcode" w:hAnsi="3 of 9 Barcode"/>
+                <w:noProof/>
+              </w:rPr>
+              <w:t>*</w:t>
+            </w:r>
+            <w:r>
+              <w:rPr>
+                <w:rFonts w:ascii="3 of 9 Barcode" w:hAnsi="3 of 9 Barcode"/>
+              </w:rPr>
+              <w:t>8051234567891</w:t>
+            </w:r>
+            <w:r>
+              <w:rPr>
+                <w:rFonts w:ascii="3 of 9 Barcode" w:hAnsi="3 of 9 Barcode"/>
+                <w:noProof/>
+              </w:rPr>
+              <w:t>*</w:t>
+            </w:r>
+          </w:p>
+          <w:p>
+            <w:pPr>
+              <w:jc w:val="center"/>
+              <w:rPr>
+                <w:rFonts w:ascii="3 of 9 Barcode" w:hAnsi="3 of 9 Barcode"/>
+                <w:noProof/>
+              </w:rPr>
+            </w:pPr>
+            <w:r>
+              <w:rPr>
+                <w:rFonts w:ascii="3 of 9 Barcode" w:hAnsi="3 of 9 Barcode"/>
+                <w:noProof/>
+              </w:rPr>
+              <w:t>*</w:t>
+            </w:r>
+            <w:r>
+              <w:rPr>
+                <w:rFonts w:ascii="3 of 9 Barcode" w:hAnsi="3 of 9 Barcode"/>
+              </w:rPr>
+              <w:t>8051234567891</w:t>
+            </w:r>
+            <w:r>
+              <w:rPr>
+                <w:rFonts w:ascii="3 of 9 Barcode" w:hAnsi="3 of 9 Barcode"/>
+                <w:noProof/>
+              </w:rPr>
+              <w:t>*</w:t>
+            </w:r>
+          </w:p>
+        </w:tc>
+        <w:tc>
+          <w:tcPr>
+            <w:tcW w:w="2407" w:type="dxa"/>
+            <w:vAlign w:val="center"/>
+          </w:tcPr>
+          <w:p>
+            <w:pPr>
+              <w:jc w:val="center"/>
+              <w:rPr>
+                <w:rFonts w:ascii="3 of 9 Barcode" w:hAnsi="3 of 9 Barcode"/>
+                <w:noProof/>
+              </w:rPr>
+            </w:pPr>
+          </w:p>
+          <w:p>
+            <w:pPr>
+              <w:jc w:val="center"/>
+              <w:rPr>
+                <w:rFonts w:ascii="3 of 9 Barcode" w:hAnsi="3 of 9 Barcode"/>
+                <w:noProof/>
+              </w:rPr>
+            </w:pPr>
+            <w:r>
+              <w:rPr>
+                <w:rFonts w:ascii="3 of 9 Barcode" w:hAnsi="3 of 9 Barcode"/>
+                <w:noProof/>
+              </w:rPr>
+              <w:t>*</w:t>
+            </w:r>
+            <w:r>
+              <w:rPr>
+                <w:rFonts w:ascii="3 of 9 Barcode" w:hAnsi="3 of 9 Barcode"/>
+              </w:rPr>
+              <w:t>8051234567892</w:t>
+            </w:r>
+            <w:r>
+              <w:rPr>
+                <w:rFonts w:ascii="3 of 9 Barcode" w:hAnsi="3 of 9 Barcode"/>
+                <w:noProof/>
+              </w:rPr>
+              <w:t>*</w:t>
+            </w:r>
+          </w:p>
+          <w:p>
+            <w:pPr>
+              <w:jc w:val="center"/>
+              <w:rPr>
+                <w:rFonts w:ascii="3 of 9 Barcode" w:hAnsi="3 of 9 Barcode"/>
+                <w:noProof/>
+              </w:rPr>
+            </w:pPr>
+            <w:r>
+              <w:rPr>
+                <w:rFonts w:ascii="3 of 9 Barcode" w:hAnsi="3 of 9 Barcode"/>
+                <w:noProof/>
+              </w:rPr>
+              <w:t>*</w:t>
+            </w:r>
+            <w:r>
+              <w:rPr>
+                <w:rFonts w:ascii="3 of 9 Barcode" w:hAnsi="3 of 9 Barcode"/>
+              </w:rPr>
+              <w:t>8051234567892</w:t>
+            </w:r>
+            <w:r>
+              <w:rPr>
+                <w:rFonts w:ascii="3 of 9 Barcode" w:hAnsi="3 of 9 Barcode"/>
+                <w:noProof/>
+              </w:rPr>
+              <w:t>*</w:t>
+            </w:r>
+          </w:p>
+          <w:p>
+            <w:pPr>
+              <w:jc w:val="center"/>
+              <w:rPr>
+                <w:rFonts w:ascii="3 of 9 Barcode" w:hAnsi="3 of 9 Barcode"/>
+                <w:noProof/>
+              </w:rPr>
+            </w:pPr>
+            <w:r>
+              <w:rPr>
+                <w:rFonts w:ascii="3 of 9 Barcode" w:hAnsi="3 of 9 Barcode"/>
+                <w:noProof/>
+              </w:rPr>
+              <w:t>*</w:t>
+            </w:r>
+            <w:r>
+              <w:rPr>
+                <w:rFonts w:ascii="3 of 9 Barcode" w:hAnsi="3 of 9 Barcode"/>
+              </w:rPr>
+              <w:t>8051234567892</w:t>
+            </w:r>
+            <w:r>
+              <w:rPr>
+                <w:rFonts w:ascii="3 of 9 Barcode" w:hAnsi="3 of 9 Barcode"/>
+                <w:noProof/>
+              </w:rPr>
+              <w:t>*</w:t>
+            </w:r>
+          </w:p>
+          <w:p>
+            <w:pPr>
+              <w:jc w:val="center"/>
+              <w:rPr>
+                <w:rFonts w:ascii="3 of 9 Barcode" w:hAnsi="3 of 9 Barcode"/>
+                <w:noProof/>
+              </w:rPr>
+            </w:pPr>
+            <w:r>
+              <w:rPr>
+                <w:rFonts w:ascii="3 of 9 Barcode" w:hAnsi="3 of 9 Barcode"/>
+                <w:noProof/>
+              </w:rPr>
+              <w:t>*</w:t>
+            </w:r>
+            <w:r>
+              <w:rPr>
+                <w:rFonts w:ascii="3 of 9 Barcode" w:hAnsi="3 of 9 Barcode"/>
+              </w:rPr>
+              <w:t>8051234567892</w:t>
+            </w:r>
+            <w:r>
+              <w:rPr>
+                <w:rFonts w:ascii="3 of 9 Barcode" w:hAnsi="3 of 9 Barcode"/>
+                <w:noProof/>
+              </w:rPr>
+              <w:t>*</w:t>
+            </w:r>
+          </w:p>
+          <w:p>
+            <w:pPr>
+              <w:rPr>
+                <w:rFonts w:ascii="3 of 9 Barcode" w:hAnsi="3 of 9 Barcode"/>
+                <w:noProof/>
+              </w:rPr>
+            </w:pPr>
+          </w:p>
+        </w:tc>
+        <w:tc>
+          <w:tcPr>
+            <w:tcW w:w="2407" w:type="dxa"/>
+            <w:vAlign w:val="center"/>
+          </w:tcPr>
+          <w:p>
+            <w:pPr>
+              <w:jc w:val="center"/>
+              <w:rPr>
+                <w:rFonts w:ascii="3 of 9 Barcode" w:hAnsi="3 of 9 Barcode"/>
+                <w:noProof/>
+              </w:rPr>
+            </w:pPr>
+            <w:r>
+              <w:rPr>
+                <w:rFonts w:ascii="3 of 9 Barcode" w:hAnsi="3 of 9 Barcode"/>
+                <w:noProof/>
+              </w:rPr>
+              <w:t>*</w:t>
+            </w:r>
+            <w:r>
+              <w:rPr>
+                <w:rFonts w:ascii="3 of 9 Barcode" w:hAnsi="3 of 9 Barcode"/>
+              </w:rPr>
+              <w:t>8051234567893</w:t>
+            </w:r>
+            <w:r>
+              <w:rPr>
+                <w:rFonts w:ascii="3 of 9 Barcode" w:hAnsi="3 of 9 Barcode"/>
+                <w:noProof/>
+              </w:rPr>
+              <w:t>*</w:t>
+            </w:r>
+          </w:p>
+          <w:p>
+            <w:pPr>
+              <w:jc w:val="center"/>
+              <w:rPr>
+                <w:rFonts w:ascii="3 of 9 Barcode" w:hAnsi="3 of 9 Barcode"/>
+                <w:noProof/>
+              </w:rPr>
+            </w:pPr>
+            <w:r>
+              <w:rPr>
+                <w:rFonts w:ascii="3 of 9 Barcode" w:hAnsi="3 of 9 Barcode"/>
+                <w:noProof/>
+              </w:rPr>
+              <w:t>*</w:t>
+            </w:r>
+            <w:r>
+              <w:rPr>
+                <w:rFonts w:ascii="3 of 9 Barcode" w:hAnsi="3 of 9 Barcode"/>
+              </w:rPr>
+              <w:t>8051234567893</w:t>
+            </w:r>
+            <w:r>
+              <w:rPr>
+                <w:rFonts w:ascii="3 of 9 Barcode" w:hAnsi="3 of 9 Barcode"/>
+                <w:noProof/>
+              </w:rPr>
+              <w:t>*</w:t>
+            </w:r>
+          </w:p>
+          <w:p>
+            <w:pPr>
+              <w:jc w:val="center"/>
+              <w:rPr>
+                <w:rFonts w:ascii="3 of 9 Barcode" w:hAnsi="3 of 9 Barcode"/>
+                <w:noProof/>
+              </w:rPr>
+            </w:pPr>
+            <w:r>
+              <w:rPr>
+                <w:rFonts w:ascii="3 of 9 Barcode" w:hAnsi="3 of 9 Barcode"/>
+                <w:noProof/>
+              </w:rPr>
+              <w:t>*</w:t>
+            </w:r>
+            <w:r>
+              <w:rPr>
+                <w:rFonts w:ascii="3 of 9 Barcode" w:hAnsi="3 of 9 Barcode"/>
+              </w:rPr>
+              <w:t>8051234567893</w:t>
+            </w:r>
+            <w:r>
+              <w:rPr>
+                <w:rFonts w:ascii="3 of 9 Barcode" w:hAnsi="3 of 9 Barcode"/>
+                <w:noProof/>
+              </w:rPr>
+              <w:t>*</w:t>
+            </w:r>
+          </w:p>
+          <w:p>
+            <w:pPr>
+              <w:jc w:val="center"/>
+              <w:rPr>
+                <w:rFonts w:ascii="3 of 9 Barcode" w:hAnsi="3 of 9 Barcode"/>
+                <w:noProof/>
+              </w:rPr>
+            </w:pPr>
+            <w:r>
+              <w:rPr>
+                <w:rFonts w:ascii="3 of 9 Barcode" w:hAnsi="3 of 9 Barcode"/>
+                <w:noProof/>
+              </w:rPr>
+              <w:t>*</w:t>
+            </w:r>
+            <w:r>
+              <w:rPr>
+                <w:rFonts w:ascii="3 of 9 Barcode" w:hAnsi="3 of 9 Barcode"/>
+              </w:rPr>
+              <w:t>8051234567893</w:t>
+            </w:r>
+            <w:r>
+              <w:rPr>
+                <w:rFonts w:ascii="3 of 9 Barcode" w:hAnsi="3 of 9 Barcode"/>
+                <w:noProof/>
+              </w:rPr>
+              <w:t>*</w:t>
+            </w:r>
+          </w:p>
+        </w:tc>
+      </w:tr>
+      <w:tr>
+        <w:tc>
+          <w:tcPr>
+            <w:tcW w:w="2407" w:type="dxa"/>
+            <w:vAlign w:val="center"/>
+          </w:tcPr>
+          <w:p>
+            <w:pPr>
+              <w:jc w:val="center"/>
+              <w:rPr>
+                <w:rFonts w:ascii="3 of 9 Barcode" w:hAnsi="3 of 9 Barcode"/>
+                <w:noProof/>
+              </w:rPr>
+            </w:pPr>
+          </w:p>
+        </w:tc>
+        <w:tc>
+          <w:tcPr>
+            <w:tcW w:w="2407" w:type="dxa"/>
+            <w:vAlign w:val="center"/>
+          </w:tcPr>
+          <w:p>
+            <w:pPr>
+              <w:jc w:val="center"/>
+              <w:rPr>
+                <w:rFonts w:ascii="3 of 9 Barcode" w:hAnsi="3 of 9 Barcode"/>
+                <w:noProof/>
+              </w:rPr>
+            </w:pPr>
+          </w:p>
+        </w:tc>
+        <w:tc>
+          <w:tcPr>
+            <w:tcW w:w="2407" w:type="dxa"/>
+            <w:vAlign w:val="center"/>
+          </w:tcPr>
+          <w:p>
+            <w:pPr>
+              <w:jc w:val="center"/>
+              <w:rPr>
+                <w:rFonts w:ascii="3 of 9 Barcode" w:hAnsi="3 of 9 Barcode"/>
+                <w:noProof/>
+              </w:rPr>
+            </w:pPr>
+          </w:p>
+        </w:tc>
+        <w:tc>
+          <w:tcPr>
+            <w:tcW w:w="2407" w:type="dxa"/>
+            <w:vAlign w:val="center"/>
+          </w:tcPr>
+          <w:p>
+            <w:pPr>
+              <w:jc w:val="center"/>
+              <w:rPr>
+                <w:rFonts w:ascii="3 of 9 Barcode" w:hAnsi="3 of 9 Barcode"/>
+                <w:noProof/>
+              </w:rPr>
+            </w:pPr>
           </w:p>
         </w:tc>
       </w:tr>

</xml_diff>